<commit_message>
Gap-fill: 27 role guides, Help admin/feedback/onboarding, expanded workflows, and tests.
Adds remaining role MD guides, EN/AR workflow help content, HelpAdminPage/FieldHelp UI, feedback and onboarding flows, generator updates, and expanded implementation framework tests.

Co-authored-by: Cursor <cursoragent@cursor.com>
</commit_message>
<xml_diff>
--- a/docs/user-guides/Role_Based_User_Guide.docx
+++ b/docs/user-guides/Role_Based_User_Guide.docx
@@ -36,12 +36,25 @@
         <w:pStyle w:val="Heading1"/>
       </w:pPr>
       <w:r>
-        <w:t>System Administrator</w:t>
+        <w:t>Group Administrator</w:t>
       </w:r>
     </w:p>
     <w:p>
       <w:r>
-        <w:t>Primary focus: Users, groups, modules, sequences, companies, settings. See Markdown role file system-admin.md for routes.</w:t>
+        <w:t>Primary focus: Group-level companies, multi-country entities, cross-facility governance. See Markdown role file group-admin.md for routes.</w:t>
+      </w:r>
+    </w:p>
+    <w:p>
+      <w:pPr>
+        <w:pStyle w:val="Heading1"/>
+      </w:pPr>
+      <w:r>
+        <w:t>Country Administrator</w:t>
+      </w:r>
+    </w:p>
+    <w:p>
+      <w:r>
+        <w:t>Primary focus: UAE or Qatar legal entity settings, currency, country-scoped users. See Markdown role file country-admin.md for routes.</w:t>
       </w:r>
     </w:p>
     <w:p>
@@ -62,12 +75,38 @@
         <w:pStyle w:val="Heading1"/>
       </w:pPr>
       <w:r>
-        <w:t>Physician</w:t>
+        <w:t>System Administrator</w:t>
       </w:r>
     </w:p>
     <w:p>
       <w:r>
-        <w:t>Primary focus: Patients, evaluations, prescriptions, appointments, procedures. See Markdown role file physician.md for routes.</w:t>
+        <w:t>Primary focus: Users, groups, modules, sequences, companies, settings. See Markdown role file system-admin.md for routes.</w:t>
+      </w:r>
+    </w:p>
+    <w:p>
+      <w:pPr>
+        <w:pStyle w:val="Heading1"/>
+      </w:pPr>
+      <w:r>
+        <w:t>Registration and Reception</w:t>
+      </w:r>
+    </w:p>
+    <w:p>
+      <w:r>
+        <w:t>Primary focus: Patients create, appointments, check-in, demographics. See Markdown role file receptionist.md for routes.</w:t>
+      </w:r>
+    </w:p>
+    <w:p>
+      <w:pPr>
+        <w:pStyle w:val="Heading1"/>
+      </w:pPr>
+      <w:r>
+        <w:t>Call Centre</w:t>
+      </w:r>
+    </w:p>
+    <w:p>
+      <w:r>
+        <w:t>Primary focus: Phone booking, appointment reminders, patient inquiries. See Markdown role file call-centre.md for routes.</w:t>
       </w:r>
     </w:p>
     <w:p>
@@ -88,12 +127,38 @@
         <w:pStyle w:val="Heading1"/>
       </w:pPr>
       <w:r>
-        <w:t>Receptionist</w:t>
+        <w:t>Triage Nurse</w:t>
       </w:r>
     </w:p>
     <w:p>
       <w:r>
-        <w:t>Primary focus: Patients create, appointments, check-in. See Markdown role file receptionist.md for routes.</w:t>
+        <w:t>Primary focus: ED/OPD triage acuity, initial vitals, routing to clinician. See Markdown role file triage-nurse.md for routes.</w:t>
+      </w:r>
+    </w:p>
+    <w:p>
+      <w:pPr>
+        <w:pStyle w:val="Heading1"/>
+      </w:pPr>
+      <w:r>
+        <w:t>Doctor</w:t>
+      </w:r>
+    </w:p>
+    <w:p>
+      <w:r>
+        <w:t>Primary focus: Patients, evaluations, prescriptions, appointments, procedures. See Markdown role file physician.md for routes.</w:t>
+      </w:r>
+    </w:p>
+    <w:p>
+      <w:pPr>
+        <w:pStyle w:val="Heading1"/>
+      </w:pPr>
+      <w:r>
+        <w:t>Surgeon</w:t>
+      </w:r>
+    </w:p>
+    <w:p>
+      <w:r>
+        <w:t>Primary focus: Surgery requests, OR scheduling, operative notes (SAO deep). See Markdown role file surgeon.md for routes.</w:t>
       </w:r>
     </w:p>
     <w:p>
@@ -106,7 +171,46 @@
     </w:p>
     <w:p>
       <w:r>
-        <w:t>Primary focus: Laboratory orders/results. See Markdown role file lab-tech.md for routes.</w:t>
+        <w:t>Primary focus: Laboratory sample processing and results entry. See Markdown role file lab-tech.md for routes.</w:t>
+      </w:r>
+    </w:p>
+    <w:p>
+      <w:pPr>
+        <w:pStyle w:val="Heading1"/>
+      </w:pPr>
+      <w:r>
+        <w:t>Laboratory Supervisor</w:t>
+      </w:r>
+    </w:p>
+    <w:p>
+      <w:r>
+        <w:t>Primary focus: Lab result approval, QC, analyzer configuration. See Markdown role file lab-supervisor.md for routes.</w:t>
+      </w:r>
+    </w:p>
+    <w:p>
+      <w:pPr>
+        <w:pStyle w:val="Heading1"/>
+      </w:pPr>
+      <w:r>
+        <w:t>Radiology Technician</w:t>
+      </w:r>
+    </w:p>
+    <w:p>
+      <w:r>
+        <w:t>Primary focus: Imaging requests, acquisition, worklist. See Markdown role file imaging-tech.md for routes.</w:t>
+      </w:r>
+    </w:p>
+    <w:p>
+      <w:pPr>
+        <w:pStyle w:val="Heading1"/>
+      </w:pPr>
+      <w:r>
+        <w:t>Radiologist</w:t>
+      </w:r>
+    </w:p>
+    <w:p>
+      <w:r>
+        <w:t>Primary focus: Imaging report interpretation and approval. See Markdown role file radiologist.md for routes.</w:t>
       </w:r>
     </w:p>
     <w:p>
@@ -119,7 +223,7 @@
     </w:p>
     <w:p>
       <w:r>
-        <w:t>Primary focus: Pharmacy, medications, stock. See Markdown role file pharmacist.md for routes.</w:t>
+        <w:t>Primary focus: Prescription review, dispensing, controlled drugs. See Markdown role file pharmacist.md for routes.</w:t>
       </w:r>
     </w:p>
     <w:p>
@@ -127,12 +231,12 @@
         <w:pStyle w:val="Heading1"/>
       </w:pPr>
       <w:r>
-        <w:t>Billing / Finance Officer</w:t>
+        <w:t>Pharmacy Assistant</w:t>
       </w:r>
     </w:p>
     <w:p>
       <w:r>
-        <w:t>Primary focus: Financial, products, insurance (SAO deep). See Markdown role file billing.md for routes.</w:t>
+        <w:t>Primary focus: Dispense support, stock picks, labelling under pharmacist oversight. See Markdown role file pharmacy-assistant.md for routes.</w:t>
       </w:r>
     </w:p>
     <w:p>
@@ -140,12 +244,12 @@
         <w:pStyle w:val="Heading1"/>
       </w:pPr>
       <w:r>
-        <w:t>Warehouse / Inventory Clerk</w:t>
+        <w:t>Cashier</w:t>
       </w:r>
     </w:p>
     <w:p>
       <w:r>
-        <w:t>Primary focus: Stock locations and moves. See Markdown role file warehouse.md for routes.</w:t>
+        <w:t>Primary focus: Patient payments, receipts, cash session close. See Markdown role file cashier.md for routes.</w:t>
       </w:r>
     </w:p>
     <w:p>
@@ -153,12 +257,12 @@
         <w:pStyle w:val="Heading1"/>
       </w:pPr>
       <w:r>
-        <w:t>Imaging Technician</w:t>
+        <w:t>Billing Employee</w:t>
       </w:r>
     </w:p>
     <w:p>
       <w:r>
-        <w:t>Primary focus: Imaging requests/results. See Markdown role file imaging-tech.md for routes.</w:t>
+        <w:t>Primary focus: Invoices, products, patient billing queues. See Markdown role file billing.md for routes.</w:t>
       </w:r>
     </w:p>
     <w:p>
@@ -166,12 +270,12 @@
         <w:pStyle w:val="Heading1"/>
       </w:pPr>
       <w:r>
-        <w:t>Compliance / Privacy Officer</w:t>
+        <w:t>Insurance and Claims Employee</w:t>
       </w:r>
     </w:p>
     <w:p>
       <w:r>
-        <w:t>Primary focus: Audit expectations, synthetic policy, access reviews. See Markdown role file compliance.md for routes.</w:t>
+        <w:t>Primary focus: Payer claims, eClaim preparation, rejection handling. See Markdown role file insurance-claims.md for routes.</w:t>
       </w:r>
     </w:p>
     <w:p>
@@ -179,12 +283,77 @@
         <w:pStyle w:val="Heading1"/>
       </w:pPr>
       <w:r>
-        <w:t>Executive / Management</w:t>
+        <w:t>Finance Employee</w:t>
       </w:r>
     </w:p>
     <w:p>
       <w:r>
-        <w:t>Primary focus: Dashboard KPIs, reporting (SAO). See Markdown role file executive.md for routes.</w:t>
+        <w:t>Primary focus: Chart of accounts, periods, journals (primarily SAO). See Markdown role file finance.md for routes.</w:t>
+      </w:r>
+    </w:p>
+    <w:p>
+      <w:pPr>
+        <w:pStyle w:val="Heading1"/>
+      </w:pPr>
+      <w:r>
+        <w:t>Procurement Employee</w:t>
+      </w:r>
+    </w:p>
+    <w:p>
+      <w:r>
+        <w:t>Primary focus: Purchase orders, supplier parties, receiving coordination. See Markdown role file procurement.md for routes.</w:t>
+      </w:r>
+    </w:p>
+    <w:p>
+      <w:pPr>
+        <w:pStyle w:val="Heading1"/>
+      </w:pPr>
+      <w:r>
+        <w:t>Inventory Employee</w:t>
+      </w:r>
+    </w:p>
+    <w:p>
+      <w:r>
+        <w:t>Primary focus: Stock locations, moves, inventory counts. See Markdown role file warehouse.md for routes.</w:t>
+      </w:r>
+    </w:p>
+    <w:p>
+      <w:pPr>
+        <w:pStyle w:val="Heading1"/>
+      </w:pPr>
+      <w:r>
+        <w:t>HR Employee</w:t>
+      </w:r>
+    </w:p>
+    <w:p>
+      <w:r>
+        <w:t>Primary focus: Health professionals, party employment attributes, scheduling support. See Markdown role file hr.md for routes.</w:t>
+      </w:r>
+    </w:p>
+    <w:p>
+      <w:pPr>
+        <w:pStyle w:val="Heading1"/>
+      </w:pPr>
+      <w:r>
+        <w:t>Department Manager</w:t>
+      </w:r>
+    </w:p>
+    <w:p>
+      <w:r>
+        <w:t>Primary focus: Department KPIs, staff roster awareness, local approvals. See Markdown role file dept-manager.md for routes.</w:t>
+      </w:r>
+    </w:p>
+    <w:p>
+      <w:pPr>
+        <w:pStyle w:val="Heading1"/>
+      </w:pPr>
+      <w:r>
+        <w:t>Hospital Management</w:t>
+      </w:r>
+    </w:p>
+    <w:p>
+      <w:r>
+        <w:t>Primary focus: Dashboard KPIs, executive reporting (SAO). See Markdown role file executive.md for routes.</w:t>
       </w:r>
     </w:p>
     <w:p>
@@ -205,12 +374,12 @@
         <w:pStyle w:val="Heading1"/>
       </w:pPr>
       <w:r>
-        <w:t>Medical Records Officer</w:t>
+        <w:t>Auditor</w:t>
       </w:r>
     </w:p>
     <w:p>
       <w:r>
-        <w:t>Primary focus: Parties, patient chart completeness, archives. See Markdown role file medical-records.md for routes.</w:t>
+        <w:t>Primary focus: Read-only audit of access, synthetic policy, compliance evidence packs. See Markdown role file auditor.md for routes.</w:t>
       </w:r>
     </w:p>
     <w:sectPr>

</xml_diff>